<commit_message>
Document live validation, quick start, and continuation handoff
</commit_message>
<xml_diff>
--- a/docs/FaultLab_Quick_Start_Guide.docx
+++ b/docs/FaultLab_Quick_Start_Guide.docx
@@ -625,7 +625,7 @@
         <w:t>./scripts/setup.sh</w:t>
       </w:r>
       <w:r>
-        <w:t xml:space="preserve"> once first. If an ordinary backend already uses port 8000, stop that backend with Ctrl+C before starting the live backend. Keep an already-running simulator or frontend; do not launch duplicate copies.</w:t>
+        <w:t xml:space="preserve"> once first. If any backend already uses port 8000, stop it with Ctrl+C and restart with the live launcher so it loads the current code and model. Keep an already-running simulator or frontend; do not launch duplicate copies.</w:t>
       </w:r>
     </w:p>
     <w:p>
@@ -666,7 +666,7 @@
           <w:rFonts w:ascii="Courier New" w:hAnsi="Courier New"/>
           <w:sz w:val="20"/>
         </w:rPr>
-        <w:t>openai/gpt-oss-120b</w:t>
+        <w:t>deepseek-ai/DeepSeek-V4-Pro-0813</w:t>
       </w:r>
       <w:r>
         <w:t xml:space="preserve"> and W&amp;B's canonical project </w:t>
@@ -679,7 +679,7 @@
         <w:t>shreetbohara-quinstreet/Faultlab</w:t>
       </w:r>
       <w:r>
-        <w:t>. It sets ceilings of 6,000 calls, 60 million tokens and $100 per campaign, with verified model rates. Starting services makes no model calls. Keep settings and source unchanged during a campaign; the live launcher disables automatic reloads.</w:t>
+        <w:t>. It sets ceilings of 6,000 calls, 204 million tokens and $100 per campaign, with verified model rates. Starting services makes no model calls. Keep settings and source unchanged during a campaign; the live launcher disables automatic reloads.</w:t>
       </w:r>
     </w:p>
     <w:p>
@@ -710,7 +710,16 @@
         <w:t>Backend connected</w:t>
       </w:r>
       <w:r>
-        <w:t xml:space="preserve">. The page reads health and configuration; it has not started a run. If disconnected, check the backend terminal and click </w:t>
+        <w:t xml:space="preserve"> and </w:t>
+      </w:r>
+      <w:r>
+        <w:rPr>
+          <w:b/>
+        </w:rPr>
+        <w:t>deepseek-ai/DeepSeek-V4-Pro-0813</w:t>
+      </w:r>
+      <w:r>
+        <w:t xml:space="preserve"> in Run desk. The page reads health and configuration; it has not started a run. If disconnected, check the backend terminal and click </w:t>
       </w:r>
       <w:r>
         <w:rPr>
@@ -753,7 +762,7 @@
           <w:rFonts w:ascii="Courier New" w:hAnsi="Courier New"/>
           <w:sz w:val="20"/>
         </w:rPr>
-        <w:t>WANDB_PROJECT=Faultlab WANDB_MODEL='openai/gpt-oss-120b' \</w:t>
+        <w:t>WANDB_PROJECT=Faultlab WANDB_MODEL='deepseek-ai/DeepSeek-V4-Pro-0813' \</w:t>
       </w:r>
     </w:p>
     <w:p>
@@ -807,7 +816,7 @@
         <w:t>Why.</w:t>
       </w:r>
       <w:r>
-        <w:t xml:space="preserve"> This catches account and trace-connection problems before a longer experiment. GPT-OSS uses reasoning tokens; the default 32-token smoke limit can end before it returns a final answer. This explicit limit matches the campaign's existing per-call ceiling.</w:t>
+        <w:t xml:space="preserve"> This catches account and trace-connection problems before a longer experiment. DeepSeek V4 Pro is selected after real action, report, scenario and diagnosis checks. Thinking is disabled using W&amp;B’s documented setting so the model returns its final answer within the call allowance. This command checks the connection; the runtime also uses JSON mode and exact action schemas. The explicit limit matches the campaign's existing per-call ceiling.</w:t>
       </w:r>
     </w:p>
     <w:p>
@@ -832,6 +841,65 @@
       </w:r>
       <w:r>
         <w:t xml:space="preserve"> The result appears in Terminal. The dashboard does not create or start a campaign from this command.</w:t>
+      </w:r>
+    </w:p>
+    <w:p>
+      <w:r/>
+      <w:r>
+        <w:rPr>
+          <w:b/>
+        </w:rPr>
+        <w:t>Check the ordinary order workflow.</w:t>
+      </w:r>
+      <w:r>
+        <w:t xml:space="preserve"> Before fault testing, run:</w:t>
+      </w:r>
+    </w:p>
+    <w:p>
+      <w:pPr>
+        <w:keepNext w:val="0"/>
+        <w:spacing w:after="20"/>
+        <w:ind w:left="216"/>
+      </w:pPr>
+      <w:r>
+        <w:rPr>
+          <w:rFonts w:ascii="Courier New" w:hAnsi="Courier New"/>
+          <w:sz w:val="20"/>
+        </w:rPr>
+        <w:t>./scripts/run-demo.sh --mode baseline --execute-live --wait</w:t>
+      </w:r>
+    </w:p>
+    <w:p>
+      <w:r>
+        <w:t xml:space="preserve">This checks that the whole product can upgrade and confirm an order without injected faults. The backend calls the real model and local mock APIs, checks the final report and verifies its Weave trace. In the frontend, paste the printed campaign ID into </w:t>
+      </w:r>
+      <w:r>
+        <w:rPr>
+          <w:b/>
+        </w:rPr>
+        <w:t>Open saved campaign</w:t>
+      </w:r>
+      <w:r>
+        <w:t xml:space="preserve"> and click </w:t>
+      </w:r>
+      <w:r>
+        <w:rPr>
+          <w:b/>
+        </w:rPr>
+        <w:t>Load recording</w:t>
+      </w:r>
+      <w:r>
+        <w:t xml:space="preserve">. Expect </w:t>
+      </w:r>
+      <w:r>
+        <w:rPr>
+          <w:rFonts w:ascii="Courier New" w:hAnsi="Courier New"/>
+          <w:sz w:val="20"/>
+        </w:rPr>
+        <w:t>COMPLETED</w:t>
+      </w:r>
+      <w:r>
+        <w:t xml:space="preserve"> and eight passing checks. This is one healthy episode; the 36-trial research baseline is separate.</w:t>
       </w:r>
     </w:p>
     <w:p>
@@ -901,6 +969,15 @@
           <w:sz w:val="20"/>
         </w:rPr>
         <w:t>order-live-demo</w:t>
+      </w:r>
+      <w:r>
+        <w:t xml:space="preserve">. If playback is active, click </w:t>
+      </w:r>
+      <w:r>
+        <w:rPr>
+          <w:b/>
+        </w:rPr>
+        <w:t>Exit playback</w:t>
       </w:r>
       <w:r>
         <w:t xml:space="preserve">. Click </w:t>
@@ -1007,11 +1084,6 @@
       </w:r>
       <w:r>
         <w:t xml:space="preserve"> to follow it. Loading does not start another run. Leave all three service terminals open.</w:t>
-      </w:r>
-    </w:p>
-    <w:p>
-      <w:r>
-        <w:br w:type="page"/>
       </w:r>
     </w:p>
     <w:p>
@@ -1861,7 +1933,7 @@
         <w:t>Policy content and complete provenance</w:t>
       </w:r>
       <w:r>
-        <w:t xml:space="preserve"> to inspect its decision. No proposal was generated in the recorded NO_CHANGE run. Under </w:t>
+        <w:t xml:space="preserve"> to inspect its decision. Under </w:t>
       </w:r>
       <w:r>
         <w:rPr>
@@ -2619,7 +2691,7 @@
               <w:rPr>
                 <w:sz w:val="21"/>
               </w:rPr>
-              <w:t>T039 baseline study</w:t>
+              <w:t>T039 baseline study done</w:t>
             </w:r>
           </w:p>
         </w:tc>
@@ -2648,20 +2720,7 @@
               <w:rPr>
                 <w:sz w:val="21"/>
               </w:rPr>
-              <w:t xml:space="preserve">Six development cases with three B0/B1 pairs each. The command is in </w:t>
-            </w:r>
-            <w:r>
-              <w:rPr>
-                <w:rFonts w:ascii="Courier New" w:hAnsi="Courier New"/>
-                <w:sz w:val="20"/>
-              </w:rPr>
-              <w:t>docs/live-validation.md</w:t>
-            </w:r>
-            <w:r>
-              <w:rPr>
-                <w:sz w:val="21"/>
-              </w:rPr>
-              <w:t>; Run baseline runs only one healthy episode.</w:t>
+              <w:t>All 36 B0/B1 trials completed with Llama; the fixed scores were verified in Weave. DeepSeek is now the selected model.</w:t>
             </w:r>
           </w:p>
         </w:tc>
@@ -2993,10 +3052,20 @@
         <w:rPr>
           <w:b/>
         </w:rPr>
-        <w:t>Observed live result.</w:t>
+        <w:t>Verified here.</w:t>
       </w:r>
       <w:r>
-        <w:t xml:space="preserve"> The tested campaign finished NO_CHANGE: one order completed, one trial violated a check, and six trials received no usable final model answer. Repair stages were not reached. See </w:t>
+        <w:t xml:space="preserve"> V4 Pro completed the healthy order with all eight checks passing. The final learning attempt made 44 model calls without provider errors; all eight traces were verified in Weave. It found no fixed-rule failure, so it finished </w:t>
+      </w:r>
+      <w:r>
+        <w:rPr>
+          <w:rFonts w:ascii="Courier New" w:hAnsi="Courier New"/>
+          <w:sz w:val="20"/>
+        </w:rPr>
+        <w:t>NO_CHANGE</w:t>
+      </w:r>
+      <w:r>
+        <w:t xml:space="preserve">. Automatic repair, challenge and promotion remain unverified live. See </w:t>
       </w:r>
       <w:r>
         <w:rPr>
@@ -3016,7 +3085,7 @@
         <w:t>docs/sponsor-results.md</w:t>
       </w:r>
       <w:r>
-        <w:t xml:space="preserve"> for exact evidence. Additional studies have separate campaign budgets. Stop service terminals with Ctrl+C when finished; local history remains saved.</w:t>
+        <w:t xml:space="preserve"> for the evidence. Additional studies have separate campaign budgets. Stop service terminals with Ctrl+C when finished; local history remains saved.</w:t>
       </w:r>
     </w:p>
     <w:sectPr>

</xml_diff>